<commit_message>
3AS GE derivability plans: use the program's economic terms (marginal/total/average cost)
Co-Authored-By: Claude Opus 5.5 <noreply@anthropic.com>
Claude-Session: https://claude.ai/code/session_015WVgZKTbSWpZTjn6aZsqC9
</commit_message>
<xml_diff>
--- a/documents/3as_ge/modhakirat/modhakira_wahda2_3as_ge.docx
+++ b/documents/3as_ge/modhakirat/modhakira_wahda2_3as_ge.docx
@@ -194,7 +194,7 @@
               <w:rPr>
                 <w:rtl/>
               </w:rPr>
-              <w:t xml:space="preserve">تطبيقات اقتصادية: التكلفة المتوسطة والحدية ، الربح.</w:t>
+              <w:t xml:space="preserve">تطبيقات اقتصادية: الكلفة الإجمالية والهامشية والمتوسطة ، الربح.</w:t>
             </w:r>
           </w:p>
           <w:p>
@@ -6855,7 +6855,7 @@
                     <w:rPr>
                       <w:rtl/>
                     </w:rPr>
-                    <w:t xml:space="preserve">تطبيقات اقتصادية: التكلفة المتوسطة والحدية ، الربح</w:t>
+                    <w:t xml:space="preserve">تطبيقات اقتصادية: الكلفة الإجمالية ، الكلفة الهامشية ، الكلفة المتوسطة ، الربح</w:t>
                   </w:r>
                 </w:p>
               </w:tc>
@@ -6925,7 +6925,7 @@
               <w:rPr>
                 <w:rtl/>
               </w:rPr>
-              <w:t xml:space="preserve">توظيف المشتقات في مسائل اقتصادية (تكلفة ، إيراد ، ربح).</w:t>
+              <w:t xml:space="preserve">توظيف المشتقات في مسائل اقتصادية (الكلفة الإجمالية والهامشية والمتوسطة ، الربح).</w:t>
             </w:r>
           </w:p>
         </w:tc>
@@ -7181,7 +7181,7 @@
               <w:rPr>
                 <w:rtl/>
               </w:rPr>
-              <w:t xml:space="preserve">وحدة: كيف تختار الكمية التي تجعل التكلفة المتوسطة أصغر ما يمكن؟</w:t>
+              <w:t xml:space="preserve">وحدة: كيف تختار الكمية التي تجعل الكلفة المتوسطة أصغر ما يمكن؟</w:t>
             </w:r>
           </w:p>
         </w:tc>
@@ -7264,7 +7264,7 @@
               <w:rPr>
                 <w:rtl/>
               </w:rPr>
-              <w:t xml:space="preserve"> التكلفة الكلية</w:t>
+              <w:t xml:space="preserve"> الكلفة الإجمالية</w:t>
             </w:r>
             <w:r>
               <w:rPr>
@@ -7339,7 +7339,7 @@
               <w:rPr>
                 <w:rtl/>
               </w:rPr>
-              <w:t xml:space="preserve">(بالألف DA) ،</w:t>
+              <w:t xml:space="preserve">(بآلاف الدنانير) ،</w:t>
             </w:r>
             <w:r>
               <w:rPr>
@@ -7377,7 +7377,52 @@
               <w:rPr>
                 <w:rtl/>
               </w:rPr>
-              <w:t xml:space="preserve">✓ التكلفة المتوسطة</w:t>
+              <w:t xml:space="preserve">✓ الكلفة الثابتة</w:t>
+            </w:r>
+            <w:r>
+              <w:rPr>
+                <w:rtl/>
+              </w:rPr>
+              <w:t xml:space="preserve"> </w:t>
+            </w:r>
+            <m:oMath>
+              <m:r>
+                <m:t>C</m:t>
+              </m:r>
+              <m:d>
+                <m:dPr>
+                  <m:begChr m:val="("/>
+                  <m:endChr m:val=")"/>
+                  <m:sepChr m:val=""/>
+                  <m:grow/>
+                </m:dPr>
+                <m:e>
+                  <m:r>
+                    <m:t>0</m:t>
+                  </m:r>
+                </m:e>
+              </m:d>
+              <m:r>
+                <m:rPr>
+                  <m:sty m:val="p"/>
+                </m:rPr>
+                <m:t>=</m:t>
+              </m:r>
+              <m:r>
+                <m:t>400</m:t>
+              </m:r>
+            </m:oMath>
+            <w:r>
+              <w:rPr>
+                <w:rtl/>
+              </w:rPr>
+              <w:t xml:space="preserve"> </w:t>
+            </w:r>
+            <w:r>
+              <w:rPr>
+                <w:rtl/>
+              </w:rPr>
+              <w:t xml:space="preserve">؛ الكلفة المتوسطة لوحدة:</w:t>
             </w:r>
             <w:r>
               <w:rPr>
@@ -7568,11 +7613,17 @@
               </w:rPr>
               <w:t xml:space="preserve">[تعريف]</w:t>
             </w:r>
-            <w:r>
-              <w:rPr>
-                <w:rtl/>
-              </w:rPr>
-              <w:t xml:space="preserve"> </w:t>
+          </w:p>
+          <w:p>
+            <w:pPr>
+              <w:bidi/>
+              <w:jc w:val="left"/>
+            </w:pPr>
+            <w:r>
+              <w:rPr>
+                <w:rtl/>
+              </w:rPr>
+              <w:t xml:space="preserve">✓ </w:t>
             </w:r>
             <w:r>
               <w:rPr>
@@ -7580,13 +7631,7 @@
                 <w:bCs/>
                 <w:rtl/>
               </w:rPr>
-              <w:t xml:space="preserve">التكلفة الحدية</w:t>
-            </w:r>
-            <w:r>
-              <w:rPr>
-                <w:rtl/>
-              </w:rPr>
-              <w:t xml:space="preserve">:</w:t>
+              <w:t xml:space="preserve">الكلفة الإجمالية</w:t>
             </w:r>
             <w:r>
               <w:rPr>
@@ -7595,6 +7640,183 @@
               <w:t xml:space="preserve"> </w:t>
             </w:r>
             <m:oMath>
+              <m:r>
+                <m:t>C</m:t>
+              </m:r>
+              <m:d>
+                <m:dPr>
+                  <m:begChr m:val="("/>
+                  <m:endChr m:val=")"/>
+                  <m:sepChr m:val=""/>
+                  <m:grow/>
+                </m:dPr>
+                <m:e>
+                  <m:r>
+                    <m:t>q</m:t>
+                  </m:r>
+                </m:e>
+              </m:d>
+            </m:oMath>
+            <w:r>
+              <w:rPr>
+                <w:rtl/>
+              </w:rPr>
+              <w:t xml:space="preserve">: كلفة صنع</w:t>
+            </w:r>
+            <w:r>
+              <w:rPr>
+                <w:rtl/>
+              </w:rPr>
+              <w:t xml:space="preserve"> </w:t>
+            </w:r>
+            <m:oMath>
+              <m:r>
+                <m:t>q</m:t>
+              </m:r>
+            </m:oMath>
+            <w:r>
+              <w:rPr>
+                <w:rtl/>
+              </w:rPr>
+              <w:t xml:space="preserve"> </w:t>
+            </w:r>
+            <w:r>
+              <w:rPr>
+                <w:rtl/>
+              </w:rPr>
+              <w:t xml:space="preserve">وحدة.</w:t>
+            </w:r>
+          </w:p>
+          <w:p>
+            <w:pPr>
+              <w:bidi/>
+              <w:jc w:val="left"/>
+            </w:pPr>
+            <w:r>
+              <w:rPr>
+                <w:rtl/>
+              </w:rPr>
+              <w:t xml:space="preserve">✓ </w:t>
+            </w:r>
+            <w:r>
+              <w:rPr>
+                <w:b/>
+                <w:bCs/>
+                <w:rtl/>
+              </w:rPr>
+              <w:t xml:space="preserve">الكلفة الهامشية</w:t>
+            </w:r>
+            <w:r>
+              <w:rPr>
+                <w:rtl/>
+              </w:rPr>
+              <w:t xml:space="preserve">: تزايد الكلفة الناتج عن صنع وحدة إضافية</w:t>
+            </w:r>
+            <w:r>
+              <w:rPr>
+                <w:rtl/>
+              </w:rPr>
+              <w:t xml:space="preserve"> </w:t>
+            </w:r>
+            <m:oMath>
+              <m:r>
+                <m:t>C</m:t>
+              </m:r>
+              <m:d>
+                <m:dPr>
+                  <m:begChr m:val="("/>
+                  <m:endChr m:val=")"/>
+                  <m:sepChr m:val=""/>
+                  <m:grow/>
+                </m:dPr>
+                <m:e>
+                  <m:r>
+                    <m:t>q</m:t>
+                  </m:r>
+                  <m:r>
+                    <m:rPr>
+                      <m:sty m:val="p"/>
+                    </m:rPr>
+                    <m:t>+</m:t>
+                  </m:r>
+                  <m:r>
+                    <m:t>1</m:t>
+                  </m:r>
+                </m:e>
+              </m:d>
+              <m:r>
+                <m:rPr>
+                  <m:sty m:val="p"/>
+                </m:rPr>
+                <m:t>−</m:t>
+              </m:r>
+              <m:r>
+                <m:t>C</m:t>
+              </m:r>
+              <m:d>
+                <m:dPr>
+                  <m:begChr m:val="("/>
+                  <m:endChr m:val=")"/>
+                  <m:sepChr m:val=""/>
+                  <m:grow/>
+                </m:dPr>
+                <m:e>
+                  <m:r>
+                    <m:t>q</m:t>
+                  </m:r>
+                </m:e>
+              </m:d>
+            </m:oMath>
+            <w:r>
+              <w:rPr>
+                <w:rtl/>
+              </w:rPr>
+              <w:t xml:space="preserve"> </w:t>
+            </w:r>
+            <w:r>
+              <w:rPr>
+                <w:rtl/>
+              </w:rPr>
+              <w:t xml:space="preserve">، ونضع في الاقتصاد</w:t>
+            </w:r>
+            <w:r>
+              <w:rPr>
+                <w:rtl/>
+              </w:rPr>
+              <w:t xml:space="preserve"> </w:t>
+            </w:r>
+            <m:oMath>
+              <m:sSub>
+                <m:e>
+                  <m:r>
+                    <m:t>C</m:t>
+                  </m:r>
+                </m:e>
+                <m:sub>
+                  <m:r>
+                    <m:t>m</m:t>
+                  </m:r>
+                </m:sub>
+              </m:sSub>
+              <m:d>
+                <m:dPr>
+                  <m:begChr m:val="("/>
+                  <m:endChr m:val=")"/>
+                  <m:sepChr m:val=""/>
+                  <m:grow/>
+                </m:dPr>
+                <m:e>
+                  <m:r>
+                    <m:t>q</m:t>
+                  </m:r>
+                </m:e>
+              </m:d>
+              <m:r>
+                <m:rPr>
+                  <m:sty m:val="p"/>
+                </m:rPr>
+                <m:t>=</m:t>
+              </m:r>
               <m:sSup>
                 <m:e>
                   <m:r>
@@ -7628,19 +7850,19 @@
               <w:rPr>
                 <w:rtl/>
               </w:rPr>
-              <w:t xml:space="preserve"> </w:t>
-            </w:r>
-            <w:r>
-              <w:rPr>
-                <w:rtl/>
-              </w:rPr>
-              <w:t xml:space="preserve">؛</w:t>
-            </w:r>
-            <w:r>
-              <w:rPr>
-                <w:rtl/>
-              </w:rPr>
-              <w:t xml:space="preserve"> </w:t>
+              <w:t xml:space="preserve">.</w:t>
+            </w:r>
+          </w:p>
+          <w:p>
+            <w:pPr>
+              <w:bidi/>
+              <w:jc w:val="left"/>
+            </w:pPr>
+            <w:r>
+              <w:rPr>
+                <w:rtl/>
+              </w:rPr>
+              <w:t xml:space="preserve">✓ </w:t>
             </w:r>
             <w:r>
               <w:rPr>
@@ -7648,7 +7870,7 @@
                 <w:bCs/>
                 <w:rtl/>
               </w:rPr>
-              <w:t xml:space="preserve">الإيراد</w:t>
+              <w:t xml:space="preserve">الكلفة المتوسطة</w:t>
             </w:r>
             <w:r>
               <w:rPr>
@@ -7663,9 +7885,18 @@
               <w:t xml:space="preserve"> </w:t>
             </w:r>
             <m:oMath>
-              <m:r>
-                <m:t>R</m:t>
-              </m:r>
+              <m:sSub>
+                <m:e>
+                  <m:r>
+                    <m:t>C</m:t>
+                  </m:r>
+                </m:e>
+                <m:sub>
+                  <m:r>
+                    <m:t>M</m:t>
+                  </m:r>
+                </m:sub>
+              </m:sSub>
               <m:d>
                 <m:dPr>
                   <m:begChr m:val="("/>
@@ -7685,36 +7916,52 @@
                 </m:rPr>
                 <m:t>=</m:t>
               </m:r>
-              <m:r>
-                <m:t>p</m:t>
-              </m:r>
-              <m:r>
-                <m:rPr>
-                  <m:sty m:val="p"/>
-                </m:rPr>
-                <m:t>×</m:t>
-              </m:r>
-              <m:r>
-                <m:t>q</m:t>
-              </m:r>
+              <m:f>
+                <m:fPr>
+                  <m:type m:val="bar"/>
+                </m:fPr>
+                <m:num>
+                  <m:r>
+                    <m:t>C</m:t>
+                  </m:r>
+                  <m:d>
+                    <m:dPr>
+                      <m:begChr m:val="("/>
+                      <m:endChr m:val=")"/>
+                      <m:sepChr m:val=""/>
+                      <m:grow/>
+                    </m:dPr>
+                    <m:e>
+                      <m:r>
+                        <m:t>q</m:t>
+                      </m:r>
+                    </m:e>
+                  </m:d>
+                </m:num>
+                <m:den>
+                  <m:r>
+                    <m:t>q</m:t>
+                  </m:r>
+                </m:den>
+              </m:f>
             </m:oMath>
             <w:r>
               <w:rPr>
                 <w:rtl/>
               </w:rPr>
-              <w:t xml:space="preserve"> </w:t>
-            </w:r>
-            <w:r>
-              <w:rPr>
-                <w:rtl/>
-              </w:rPr>
-              <w:t xml:space="preserve">؛</w:t>
-            </w:r>
-            <w:r>
-              <w:rPr>
-                <w:rtl/>
-              </w:rPr>
-              <w:t xml:space="preserve"> </w:t>
+              <w:t xml:space="preserve">.</w:t>
+            </w:r>
+          </w:p>
+          <w:p>
+            <w:pPr>
+              <w:bidi/>
+              <w:jc w:val="left"/>
+            </w:pPr>
+            <w:r>
+              <w:rPr>
+                <w:rtl/>
+              </w:rPr>
+              <w:t xml:space="preserve">✓ </w:t>
             </w:r>
             <w:r>
               <w:rPr>
@@ -7760,7 +8007,22 @@
                 <m:t>=</m:t>
               </m:r>
               <m:r>
-                <m:t>R</m:t>
+                <m:t>p</m:t>
+              </m:r>
+              <m:r>
+                <m:t> </m:t>
+              </m:r>
+              <m:r>
+                <m:t>q</m:t>
+              </m:r>
+              <m:r>
+                <m:rPr>
+                  <m:sty m:val="p"/>
+                </m:rPr>
+                <m:t>−</m:t>
+              </m:r>
+              <m:r>
+                <m:t>C</m:t>
               </m:r>
               <m:d>
                 <m:dPr>
@@ -7775,34 +8037,41 @@
                   </m:r>
                 </m:e>
               </m:d>
-              <m:r>
-                <m:rPr>
-                  <m:sty m:val="p"/>
-                </m:rPr>
-                <m:t>−</m:t>
-              </m:r>
-              <m:r>
-                <m:t>C</m:t>
-              </m:r>
-              <m:d>
-                <m:dPr>
-                  <m:begChr m:val="("/>
-                  <m:endChr m:val=")"/>
-                  <m:sepChr m:val=""/>
-                  <m:grow/>
-                </m:dPr>
-                <m:e>
-                  <m:r>
-                    <m:t>q</m:t>
-                  </m:r>
-                </m:e>
-              </m:d>
             </m:oMath>
             <w:r>
               <w:rPr>
                 <w:rtl/>
               </w:rPr>
-              <w:t xml:space="preserve">.</w:t>
+              <w:t xml:space="preserve"> </w:t>
+            </w:r>
+            <w:r>
+              <w:rPr>
+                <w:rtl/>
+              </w:rPr>
+              <w:t xml:space="preserve">حيث</w:t>
+            </w:r>
+            <w:r>
+              <w:rPr>
+                <w:rtl/>
+              </w:rPr>
+              <w:t xml:space="preserve"> </w:t>
+            </w:r>
+            <m:oMath>
+              <m:r>
+                <m:t>p</m:t>
+              </m:r>
+            </m:oMath>
+            <w:r>
+              <w:rPr>
+                <w:rtl/>
+              </w:rPr>
+              <w:t xml:space="preserve"> </w:t>
+            </w:r>
+            <w:r>
+              <w:rPr>
+                <w:rtl/>
+              </w:rPr>
+              <w:t xml:space="preserve">ثمن بيع الوحدة.</w:t>
             </w:r>
           </w:p>
           <w:p>
@@ -7908,7 +8177,7 @@
               <w:rPr>
                 <w:rtl/>
               </w:rPr>
-              <w:t xml:space="preserve">: أصغر تكلفة متوسطة عند</w:t>
+              <w:t xml:space="preserve">: أصغر كلفة متوسطة عند</w:t>
             </w:r>
             <w:r>
               <w:rPr>
@@ -8003,6 +8272,37 @@
               <w:t xml:space="preserve">✓ </w:t>
             </w:r>
             <m:oMath>
+              <m:sSub>
+                <m:e>
+                  <m:r>
+                    <m:t>C</m:t>
+                  </m:r>
+                </m:e>
+                <m:sub>
+                  <m:r>
+                    <m:t>m</m:t>
+                  </m:r>
+                </m:sub>
+              </m:sSub>
+              <m:d>
+                <m:dPr>
+                  <m:begChr m:val="("/>
+                  <m:endChr m:val=")"/>
+                  <m:sepChr m:val=""/>
+                  <m:grow/>
+                </m:dPr>
+                <m:e>
+                  <m:r>
+                    <m:t>20</m:t>
+                  </m:r>
+                </m:e>
+              </m:d>
+              <m:r>
+                <m:rPr>
+                  <m:sty m:val="p"/>
+                </m:rPr>
+                <m:t>=</m:t>
+              </m:r>
               <m:sSup>
                 <m:e>
                   <m:r>
@@ -8103,19 +8403,19 @@
               <w:rPr>
                 <w:rtl/>
               </w:rPr>
-              <w:t xml:space="preserve">: عند أصغر تكلفة متوسطة تتساوى التكلفتان المتوسطة والحدية.</w:t>
-            </w:r>
-          </w:p>
-          <w:p>
-            <w:pPr>
-              <w:bidi/>
-              <w:jc w:val="left"/>
-            </w:pPr>
-            <w:r>
-              <w:rPr>
-                <w:rtl/>
-              </w:rPr>
-              <w:t xml:space="preserve">✓ سعر البيع</w:t>
+              <w:t xml:space="preserve">: عند أصغر كلفة متوسطة تتساوى الكلفة الهامشية والكلفة المتوسطة.</w:t>
+            </w:r>
+          </w:p>
+          <w:p>
+            <w:pPr>
+              <w:bidi/>
+              <w:jc w:val="left"/>
+            </w:pPr>
+            <w:r>
+              <w:rPr>
+                <w:rtl/>
+              </w:rPr>
+              <w:t xml:space="preserve">✓ ثمن بيع الوحدة</w:t>
             </w:r>
             <w:r>
               <w:rPr>
@@ -8413,7 +8713,7 @@
               <w:rPr>
                 <w:rtl/>
               </w:rPr>
-              <w:t xml:space="preserve">).</w:t>
+              <w:t xml:space="preserve">) والوحدات.</w:t>
             </w:r>
           </w:p>
         </w:tc>
@@ -8494,7 +8794,7 @@
               <w:rPr>
                 <w:rtl/>
               </w:rPr>
-              <w:t xml:space="preserve">الإيراد</w:t>
+              <w:t xml:space="preserve">الكلفة الإجمالية</w:t>
             </w:r>
             <w:r>
               <w:rPr>
@@ -8504,7 +8804,7 @@
             </w:r>
             <m:oMath>
               <m:r>
-                <m:t>R</m:t>
+                <m:t>C</m:t>
               </m:r>
               <m:d>
                 <m:dPr>
@@ -8525,9 +8825,173 @@
                 </m:rPr>
                 <m:t>=</m:t>
               </m:r>
+              <m:f>
+                <m:fPr>
+                  <m:type m:val="bar"/>
+                </m:fPr>
+                <m:num>
+                  <m:r>
+                    <m:t>1</m:t>
+                  </m:r>
+                </m:num>
+                <m:den>
+                  <m:r>
+                    <m:t>3</m:t>
+                  </m:r>
+                </m:den>
+              </m:f>
+              <m:sSup>
+                <m:e>
+                  <m:r>
+                    <m:t>q</m:t>
+                  </m:r>
+                </m:e>
+                <m:sup>
+                  <m:r>
+                    <m:t>3</m:t>
+                  </m:r>
+                </m:sup>
+              </m:sSup>
+              <m:r>
+                <m:rPr>
+                  <m:sty m:val="p"/>
+                </m:rPr>
+                <m:t>−</m:t>
+              </m:r>
+              <m:r>
+                <m:t>4</m:t>
+              </m:r>
+              <m:sSup>
+                <m:e>
+                  <m:r>
+                    <m:t>q</m:t>
+                  </m:r>
+                </m:e>
+                <m:sup>
+                  <m:r>
+                    <m:t>2</m:t>
+                  </m:r>
+                </m:sup>
+              </m:sSup>
+              <m:r>
+                <m:rPr>
+                  <m:sty m:val="p"/>
+                </m:rPr>
+                <m:t>+</m:t>
+              </m:r>
+              <m:r>
+                <m:t>20</m:t>
+              </m:r>
               <m:r>
                 <m:t>q</m:t>
               </m:r>
+              <m:r>
+                <m:rPr>
+                  <m:sty m:val="p"/>
+                </m:rPr>
+                <m:t>+</m:t>
+              </m:r>
+              <m:r>
+                <m:t>50</m:t>
+              </m:r>
+            </m:oMath>
+            <w:r>
+              <w:rPr>
+                <w:rtl/>
+              </w:rPr>
+              <w:t xml:space="preserve"> </w:t>
+            </w:r>
+            <w:r>
+              <w:rPr>
+                <w:rtl/>
+              </w:rPr>
+              <w:t xml:space="preserve">(</w:t>
+            </w:r>
+            <m:oMath>
+              <m:r>
+                <m:t>0</m:t>
+              </m:r>
+              <m:r>
+                <m:rPr>
+                  <m:sty m:val="p"/>
+                </m:rPr>
+                <m:t>≤</m:t>
+              </m:r>
+              <m:r>
+                <m:t>q</m:t>
+              </m:r>
+              <m:r>
+                <m:rPr>
+                  <m:sty m:val="p"/>
+                </m:rPr>
+                <m:t>≤</m:t>
+              </m:r>
+              <m:r>
+                <m:t>20</m:t>
+              </m:r>
+            </m:oMath>
+            <w:r>
+              <w:rPr>
+                <w:rtl/>
+              </w:rPr>
+              <w:t xml:space="preserve">) وثمن بيع الوحدة</w:t>
+            </w:r>
+            <w:r>
+              <w:rPr>
+                <w:rtl/>
+              </w:rPr>
+              <w:t xml:space="preserve"> </w:t>
+            </w:r>
+            <m:oMath>
+              <m:r>
+                <m:t>68</m:t>
+              </m:r>
+            </m:oMath>
+            <w:r>
+              <w:rPr>
+                <w:rtl/>
+              </w:rPr>
+              <w:t xml:space="preserve"> </w:t>
+            </w:r>
+            <w:r>
+              <w:rPr>
+                <w:rtl/>
+              </w:rPr>
+              <w:t xml:space="preserve">DA. عيّن الكلفة الهامشية ، ثم الكمية التي تكون من أجلها الكلفة الهامشية مساوية لثمن بيع الوحدة.</w:t>
+            </w:r>
+          </w:p>
+          <w:p>
+            <w:pPr>
+              <w:bidi/>
+              <w:jc w:val="left"/>
+            </w:pPr>
+            <w:r>
+              <w:rPr>
+                <w:b/>
+                <w:bCs/>
+                <w:rtl/>
+              </w:rPr>
+              <w:t xml:space="preserve">الحل:</w:t>
+            </w:r>
+            <w:r>
+              <w:rPr>
+                <w:rtl/>
+              </w:rPr>
+              <w:t xml:space="preserve"> </w:t>
+            </w:r>
+            <m:oMath>
+              <m:sSub>
+                <m:e>
+                  <m:r>
+                    <m:t>C</m:t>
+                  </m:r>
+                </m:e>
+                <m:sub>
+                  <m:r>
+                    <m:t>m</m:t>
+                  </m:r>
+                </m:sub>
+              </m:sSub>
               <m:d>
                 <m:dPr>
                   <m:begChr m:val="("/>
@@ -8537,22 +9001,49 @@
                 </m:dPr>
                 <m:e>
                   <m:r>
-                    <m:t>100</m:t>
-                  </m:r>
-                  <m:r>
-                    <m:rPr>
-                      <m:sty m:val="p"/>
-                    </m:rPr>
-                    <m:t>−</m:t>
-                  </m:r>
+                    <m:t>q</m:t>
+                  </m:r>
+                </m:e>
+              </m:d>
+              <m:r>
+                <m:rPr>
+                  <m:sty m:val="p"/>
+                </m:rPr>
+                <m:t>=</m:t>
+              </m:r>
+              <m:sSup>
+                <m:e>
+                  <m:r>
+                    <m:t>q</m:t>
+                  </m:r>
+                </m:e>
+                <m:sup>
                   <m:r>
                     <m:t>2</m:t>
                   </m:r>
-                  <m:r>
-                    <m:t>q</m:t>
-                  </m:r>
-                </m:e>
-              </m:d>
+                </m:sup>
+              </m:sSup>
+              <m:r>
+                <m:rPr>
+                  <m:sty m:val="p"/>
+                </m:rPr>
+                <m:t>−</m:t>
+              </m:r>
+              <m:r>
+                <m:t>8</m:t>
+              </m:r>
+              <m:r>
+                <m:t>q</m:t>
+              </m:r>
+              <m:r>
+                <m:rPr>
+                  <m:sty m:val="p"/>
+                </m:rPr>
+                <m:t>+</m:t>
+              </m:r>
+              <m:r>
+                <m:t>20</m:t>
+              </m:r>
             </m:oMath>
             <w:r>
               <w:rPr>
@@ -8564,56 +9055,7 @@
               <w:rPr>
                 <w:rtl/>
               </w:rPr>
-              <w:t xml:space="preserve">،</w:t>
-            </w:r>
-            <w:r>
-              <w:rPr>
-                <w:rtl/>
-              </w:rPr>
-              <w:t xml:space="preserve"> </w:t>
-            </w:r>
-            <m:oMath>
-              <m:r>
-                <m:t>0</m:t>
-              </m:r>
-              <m:r>
-                <m:rPr>
-                  <m:sty m:val="p"/>
-                </m:rPr>
-                <m:t>≤</m:t>
-              </m:r>
-              <m:r>
-                <m:t>q</m:t>
-              </m:r>
-              <m:r>
-                <m:rPr>
-                  <m:sty m:val="p"/>
-                </m:rPr>
-                <m:t>≤</m:t>
-              </m:r>
-              <m:r>
-                <m:t>50</m:t>
-              </m:r>
-            </m:oMath>
-            <w:r>
-              <w:rPr>
-                <w:rtl/>
-              </w:rPr>
-              <w:t xml:space="preserve">. عيّن الكمية التي تعطي أكبر إيراد.</w:t>
-            </w:r>
-          </w:p>
-          <w:p>
-            <w:pPr>
-              <w:bidi/>
-              <w:jc w:val="left"/>
-            </w:pPr>
-            <w:r>
-              <w:rPr>
-                <w:b/>
-                <w:bCs/>
-                <w:rtl/>
-              </w:rPr>
-              <w:t xml:space="preserve">الحل:</w:t>
+              <w:t xml:space="preserve">؛</w:t>
             </w:r>
             <w:r>
               <w:rPr>
@@ -8625,31 +9067,98 @@
               <m:sSup>
                 <m:e>
                   <m:r>
-                    <m:t>R</m:t>
+                    <m:t>q</m:t>
                   </m:r>
                 </m:e>
                 <m:sup>
                   <m:r>
-                    <m:rPr>
-                      <m:sty m:val="p"/>
-                    </m:rPr>
-                    <m:t>′</m:t>
+                    <m:t>2</m:t>
                   </m:r>
                 </m:sup>
               </m:sSup>
-              <m:d>
-                <m:dPr>
-                  <m:begChr m:val="("/>
-                  <m:endChr m:val=")"/>
-                  <m:sepChr m:val=""/>
-                  <m:grow/>
-                </m:dPr>
+              <m:r>
+                <m:rPr>
+                  <m:sty m:val="p"/>
+                </m:rPr>
+                <m:t>−</m:t>
+              </m:r>
+              <m:r>
+                <m:t>8</m:t>
+              </m:r>
+              <m:r>
+                <m:t>q</m:t>
+              </m:r>
+              <m:r>
+                <m:rPr>
+                  <m:sty m:val="p"/>
+                </m:rPr>
+                <m:t>+</m:t>
+              </m:r>
+              <m:r>
+                <m:t>20</m:t>
+              </m:r>
+              <m:r>
+                <m:rPr>
+                  <m:sty m:val="p"/>
+                </m:rPr>
+                <m:t>=</m:t>
+              </m:r>
+              <m:r>
+                <m:t>68</m:t>
+              </m:r>
+            </m:oMath>
+            <w:r>
+              <w:rPr>
+                <w:rtl/>
+              </w:rPr>
+              <w:t xml:space="preserve"> </w:t>
+            </w:r>
+            <w:r>
+              <w:rPr>
+                <w:rtl/>
+              </w:rPr>
+              <w:t xml:space="preserve">يعطي</w:t>
+            </w:r>
+            <w:r>
+              <w:rPr>
+                <w:rtl/>
+              </w:rPr>
+              <w:t xml:space="preserve"> </w:t>
+            </w:r>
+            <m:oMath>
+              <m:sSup>
                 <m:e>
                   <m:r>
                     <m:t>q</m:t>
                   </m:r>
                 </m:e>
-              </m:d>
+                <m:sup>
+                  <m:r>
+                    <m:t>2</m:t>
+                  </m:r>
+                </m:sup>
+              </m:sSup>
+              <m:r>
+                <m:rPr>
+                  <m:sty m:val="p"/>
+                </m:rPr>
+                <m:t>−</m:t>
+              </m:r>
+              <m:r>
+                <m:t>8</m:t>
+              </m:r>
+              <m:r>
+                <m:t>q</m:t>
+              </m:r>
+              <m:r>
+                <m:rPr>
+                  <m:sty m:val="p"/>
+                </m:rPr>
+                <m:t>−</m:t>
+              </m:r>
+              <m:r>
+                <m:t>48</m:t>
+              </m:r>
               <m:r>
                 <m:rPr>
                   <m:sty m:val="p"/>
@@ -8657,8 +9166,54 @@
                 <m:t>=</m:t>
               </m:r>
               <m:r>
-                <m:t>100</m:t>
-              </m:r>
+                <m:t>0</m:t>
+              </m:r>
+            </m:oMath>
+            <w:r>
+              <w:rPr>
+                <w:rtl/>
+              </w:rPr>
+              <w:t xml:space="preserve">:</w:t>
+            </w:r>
+            <w:r>
+              <w:rPr>
+                <w:rtl/>
+              </w:rPr>
+              <w:t xml:space="preserve"> </w:t>
+            </w:r>
+            <m:oMath>
+              <m:r>
+                <m:t>q</m:t>
+              </m:r>
+              <m:r>
+                <m:rPr>
+                  <m:sty m:val="p"/>
+                </m:rPr>
+                <m:t>=</m:t>
+              </m:r>
+              <m:r>
+                <m:t>12</m:t>
+              </m:r>
+            </m:oMath>
+            <w:r>
+              <w:rPr>
+                <w:rtl/>
+              </w:rPr>
+              <w:t xml:space="preserve"> </w:t>
+            </w:r>
+            <w:r>
+              <w:rPr>
+                <w:rtl/>
+              </w:rPr>
+              <w:t xml:space="preserve">(والحل</w:t>
+            </w:r>
+            <w:r>
+              <w:rPr>
+                <w:rtl/>
+              </w:rPr>
+              <w:t xml:space="preserve"> </w:t>
+            </w:r>
+            <m:oMath>
               <m:r>
                 <m:rPr>
                   <m:sty m:val="p"/>
@@ -8668,86 +9223,18 @@
               <m:r>
                 <m:t>4</m:t>
               </m:r>
-              <m:r>
-                <m:t>q</m:t>
-              </m:r>
             </m:oMath>
             <w:r>
               <w:rPr>
                 <w:rtl/>
               </w:rPr>
-              <w:t xml:space="preserve">:</w:t>
-            </w:r>
-            <w:r>
-              <w:rPr>
-                <w:rtl/>
-              </w:rPr>
-              <w:t xml:space="preserve"> </w:t>
-            </w:r>
-            <m:oMath>
-              <m:r>
-                <m:t>q</m:t>
-              </m:r>
-              <m:r>
-                <m:rPr>
-                  <m:sty m:val="p"/>
-                </m:rPr>
-                <m:t>=</m:t>
-              </m:r>
-              <m:r>
-                <m:t>25</m:t>
-              </m:r>
-            </m:oMath>
-            <w:r>
-              <w:rPr>
-                <w:rtl/>
-              </w:rPr>
-              <w:t xml:space="preserve"> </w:t>
-            </w:r>
-            <w:r>
-              <w:rPr>
-                <w:rtl/>
-              </w:rPr>
-              <w:t xml:space="preserve">،</w:t>
-            </w:r>
-            <w:r>
-              <w:rPr>
-                <w:rtl/>
-              </w:rPr>
-              <w:t xml:space="preserve"> </w:t>
-            </w:r>
-            <m:oMath>
-              <m:r>
-                <m:t>R</m:t>
-              </m:r>
-              <m:d>
-                <m:dPr>
-                  <m:begChr m:val="("/>
-                  <m:endChr m:val=")"/>
-                  <m:sepChr m:val=""/>
-                  <m:grow/>
-                </m:dPr>
-                <m:e>
-                  <m:r>
-                    <m:t>25</m:t>
-                  </m:r>
-                </m:e>
-              </m:d>
-              <m:r>
-                <m:rPr>
-                  <m:sty m:val="p"/>
-                </m:rPr>
-                <m:t>=</m:t>
-              </m:r>
-              <m:r>
-                <m:t>1250</m:t>
-              </m:r>
-            </m:oMath>
-            <w:r>
-              <w:rPr>
-                <w:rtl/>
-              </w:rPr>
-              <w:t xml:space="preserve">.</w:t>
+              <w:t xml:space="preserve"> </w:t>
+            </w:r>
+            <w:r>
+              <w:rPr>
+                <w:rtl/>
+              </w:rPr>
+              <w:t xml:space="preserve">مرفوض).</w:t>
             </w:r>
           </w:p>
           <w:p>
@@ -12242,7 +12729,7 @@
               <w:rPr>
                 <w:rtl/>
               </w:rPr>
-              <w:t xml:space="preserve">مستمرة: يوجد</w:t>
+              <w:t xml:space="preserve">مستمرة: توجد كمية</w:t>
             </w:r>
             <w:r>
               <w:rPr>
@@ -12274,7 +12761,7 @@
               <w:rPr>
                 <w:rtl/>
               </w:rPr>
-              <w:t xml:space="preserve">(عتبة المردودية) حيث</w:t>
+              <w:t xml:space="preserve">ينعدم من أجلها الربح ، أي</w:t>
             </w:r>
             <w:r>
               <w:rPr>
@@ -13213,7 +13700,7 @@
               <w:rPr>
                 <w:rtl/>
               </w:rPr>
-              <w:t xml:space="preserve">بيّن أن عتبة المردودية</w:t>
+              <w:t xml:space="preserve">بيّن أن الكمية</w:t>
             </w:r>
             <w:r>
               <w:rPr>
@@ -13245,7 +13732,7 @@
               <w:rPr>
                 <w:rtl/>
               </w:rPr>
-              <w:t xml:space="preserve">في الوضعية وحيدة في</w:t>
+              <w:t xml:space="preserve">التي ينعدم من أجلها الربح وحيدة في</w:t>
             </w:r>
             <w:r>
               <w:rPr>

</xml_diff>